<commit_message>
nmctapp motion-brief: regenerate on the model at HEAD; still reported: the § token takes footnote 1 (docx joins its URL, latex drops it; committed latex render kept) (fb-595.54.54)
Co-Authored-By: Claude Opus 5.5 <noreply@anthropic.com>
</commit_message>
<xml_diff>
--- a/courts/tenth-circuit/new-mexico/state/court-of-appeals/motion-brief/usage/OUTPUT-motion-brief.docx
+++ b/courts/tenth-circuit/new-mexico/state/court-of-appeals/motion-brief/usage/OUTPUT-motion-brief.docx
@@ -2929,13 +2929,7 @@
         <w:noBreakHyphen/>
       </w:r>
       <w:r>
-        <w:t xml:space="preserve">409(B) (authorizing filing of motion for pretrial detention in district court); Exh. C at ¶¶ 7</w:t>
-      </w:r>
-      <w:r>
-        <w:noBreakHyphen/>
-      </w:r>
-      <w:r>
-        <w:t xml:space="preserve">8 (Expedited Motion for Pretrial Detention). But at the hearing on its motion, the state admitted that it had dismissed felony charges in the prior cases, and that Ms. Brewer had previously been placed on unsupervised probation. Exh. D at 12:04</w:t>
+        <w:t xml:space="preserve">409(B) (authorizing filing of motion for pretrial detention in district court); Exh. C at ¶¶ 7-⁠8 (Expedited Motion for Pretrial Detention). But at the hearing on its motion, the state admitted that it had dismissed felony charges in the prior cases, and that Ms. Brewer had previously been placed on unsupervised probation. Exh. D at 12:04</w:t>
       </w:r>
       <w:r>
         <w:noBreakHyphen/>
@@ -2999,13 +2993,7 @@
         <w:pStyle w:val="BodyText"/>
       </w:pPr>
       <w:r>
-        <w:t xml:space="preserve">Unsurprisingly, Ms. Brewer could not get out of jail under these conditions because, as she and her counsel made clear to the District Court, she could not afford them. So, on November 26, 2018, Ms. Brewer moved to modify her conditions of release. She noted that the District Court had imposed both house arrest and GPS monitoring, and flagged the high cost of GPS monitoring imposed by the Grant County Surveillance Program: a “start-up” fee of $65 and a monthly fee of $100. Exh. G at ¶¶ 1</w:t>
-      </w:r>
-      <w:r>
-        <w:noBreakHyphen/>
-      </w:r>
-      <w:r>
-        <w:t xml:space="preserve">3 (Motion to Review Conditions of Release). She argued that “imposition of a GPS requirement is tantamount to the imposition of a money-bond,” which she could not afford, and asked that the District Court modify the conditions of release “in order that she may be released from jail.” Id. ¶ 6 &amp; Prayer for Relief.</w:t>
+        <w:t xml:space="preserve">Unsurprisingly, Ms. Brewer could not get out of jail under these conditions because, as she and her counsel made clear to the District Court, she could not afford them. So, on November 26, 2018, Ms. Brewer moved to modify her conditions of release. She noted that the District Court had imposed both house arrest and GPS monitoring, and flagged the high cost of GPS monitoring imposed by the Grant County Surveillance Program: a “start-up” fee of $65 and a monthly fee of $100. Exh. G at ¶¶ 1-⁠3 (Motion to Review Conditions of Release). She argued that “imposition of a GPS requirement is tantamount to the imposition of a money-bond,” which she could not afford, and asked that the District Court modify the conditions of release “in order that she may be released from jail.” Id. ¶ 6 &amp; Prayer for Relief.</w:t>
       </w:r>
     </w:p>
     <w:p>
@@ -3047,7 +3035,7 @@
         <w:pStyle w:val="BodyText"/>
       </w:pPr>
       <w:r>
-        <w:t xml:space="preserve">Ms. Brewer then personally told the District Court, “It’s impossible for me to come up with the money, sitting in jail, for the [GPS ankle] bracelet. If I take this house arrest . . .” Ex. D at 21:54</w:t>
+        <w:t xml:space="preserve">Ms. Brewer then personally told the District Court, “It’s impossible for me to come up with the money, sitting in jail, for the [GPS ankle] bracelet. If I take this house arrest . . .” Ex. D at 21:54</w:t>
       </w:r>
       <w:r>
         <w:noBreakHyphen/>
@@ -3067,7 +3055,7 @@
         <w:pStyle w:val="BodyText"/>
       </w:pPr>
       <w:r>
-        <w:t xml:space="preserve">The District Court has never made “written findings of particularized reasons why . . . release w[ould] not reasonably ensure the appearance of” Ms. Brewer, see NMRA 5</w:t>
+        <w:t xml:space="preserve">The District Court has never made “written findings of particularized reasons why . . . release w[ould] not reasonably ensure the appearance of” Ms. Brewer, see NMRA 5</w:t>
       </w:r>
       <w:r>
         <w:noBreakHyphen/>
@@ -3435,7 +3423,7 @@
         <w:pStyle w:val="BodyText"/>
       </w:pPr>
       <w:r>
-        <w:t xml:space="preserve">The New Mexico Constitution has long provided that “[a]ll persons” except for capital defendants “shall . . . be bailable by sufficient sureties” and that “[e]xcessive bail shall not be required.” N.M. Const. art. II, § 13. This guarantee creates a broad presumption in favor of pre-trial release. As the New Mexico Supreme Court held in State v. Brown, “[n]either the New Mexico Constitution nor our rules of criminal procedure permit a judge to set high bail for the purpose of preventing a defendant’s pretrial release.” 2014-NMSC</w:t>
+        <w:t xml:space="preserve">The New Mexico Constitution has long provided that “[a]ll persons” except for capital defendants “shall . . . be bailable by sufficient sureties” and that “[e]xcessive bail shall not be required.” N.M. Const. art. II, § 13. This guarantee creates a broad presumption in favor of pre-trial release. As the New Mexico Supreme Court held in State v. Brown, “[n]either the New Mexico Constitution nor our rules of criminal procedure permit a judge to set high bail for the purpose of preventing a defendant’s pretrial release.” 2014-NMSC</w:t>
       </w:r>
       <w:r>
         <w:noBreakHyphen/>
@@ -4899,7 +4887,7 @@
         <w:pStyle w:val="BodyText"/>
       </w:pPr>
       <w:r>
-        <w:t xml:space="preserve">Both criteria are met here. Ms. Brewer is indigent and thus “unable to pay” for the GPS monitoring and housing that the District Court has required as conditions of release. ODonnell, 892 F.3d at 162. And, as a result, Ms. Brewer is suffering “an absolute deprivation” of her “most basic liberty interests—freedom from incarceration.” Id. Like classifications affecting fundamental rights, this type of wealth-based discrimination demands strict scrutiny. The United States Supreme Court, in rejecting criminal penalties that turned on a defendant’s wealth, has repeatedly held that the relevant state interests could “often be served fully by alternative means.” Bearden v. Georgia, 461 U.S. 660, 671–72 (1983); see also Tate, 401 U.S. at 399 (“There are, however, other alternatives to which the State may constitutionally resort to serve its concededly valid interest. . . .”); Williams v. Illinois, 399 U.S. 235, 244 (1970) (“It is unnecessary for us to canvass the numerous alternatives to which the State . . . may resort. . . .”). That is the language of strict scrutiny, which, again, demands the “the least restrictive means available.” Bernal, 467 U.S. at 219; see also Frazier v. Jordan, 457 F.2d 726, 727–28 (5th Cir. 1972) (applying strict scrutiny under Tate).</w:t>
+        <w:t xml:space="preserve">Both criteria are met here. Ms. Brewer is indigent and thus “unable to pay” for the GPS monitoring and housing that the District Court has required as conditions of release. ODonnell, 892 F.3d at 162. And, as a result, Ms. Brewer is suffering “an absolute deprivation” of her “most basic liberty interests—freedom from incarceration.” Id. Like classifications affecting fundamental rights, this type of wealth-based discrimination demands strict scrutiny. The United States Supreme Court, in rejecting criminal penalties that turned on a defendant’s wealth, has repeatedly held that the relevant state interests could “often be served fully by alternative means.” Bearden v. Georgia, 461 U.S. 660, 671–72 (1983); see also Tate, 401 U.S. at 399 (“There are, however, other alternatives to which the State may constitutionally resort to serve its concededly valid interest. . . .”); Williams v. Illinois, 399 U.S. 235, 244 (1970) (“It is unnecessary for us to canvass the numerous alternatives to which the State . . . may resort. . . .”). That is the language of strict scrutiny, which, again, demands the “the least restrictive means available.” Bernal, 467 U.S. at 219; see also Frazier v. Jordan, 457 F.2d 726, 727–28 (5th Cir. 1972) (applying strict scrutiny under Tate).</w:t>
       </w:r>
     </w:p>
     <w:p>
@@ -6051,7 +6039,7 @@
         <w:t xml:space="preserve"> </w:t>
       </w:r>
       <w:r>
-        <w:t xml:space="preserve">See also 2016 Regular Session, SJR 1, N.M. Legislature, https://​​www.​nmlegis.​gov/​​Legislation/​​Legislation?Chamber=S&amp;LegType=JR&amp;LegNo=1&amp;year=16; Official Results of Nov. 8, 2016 General Election, N.M. Sec’y of State, http://​​electionresults.​sos.​state.​nm.​us/​​resultsSW.​aspx?eid=84&amp;type=SW&amp;map=CTY.</w:t>
+        <w:t xml:space="preserve">See also 2016 Regular Session, SJR 1, N.M. Legislature, https:/⁠/⁠www.​nmlegis.​gov/​⁠Legislation/​⁠Legislation?​Chamber=S&amp;LegType=JR&amp;LegNo=1&amp;year=16; Official Results of Nov. 8, 2016 General Election, N.M. Sec’y of State, http:/⁠/⁠electionresults.sos.state.nm.us/⁠resultsSW.aspx?eid=84&amp;type=SW&amp;map=CTY.</w:t>
       </w:r>
     </w:p>
   </w:footnote>
@@ -7044,6 +7032,33 @@
     <w:pPr>
       <w:spacing w:before="0" w:after="0" w:line="322" w:lineRule="exact"/>
       <w:ind w:left="2160" w:hanging="720"/>
+    </w:pPr>
+  </w:style>
+  <w:style w:type="paragraph" w:customStyle="1" w:styleId="XdQuoteList1">
+    <w:name w:val="Xd Quote List 1"/>
+    <w:basedOn w:val="Normal"/>
+    <w:qFormat/>
+    <w:pPr>
+      <w:spacing w:before="0" w:after="0" w:line="322" w:lineRule="exact"/>
+      <w:ind w:left="1440" w:right="720" w:hanging="720"/>
+    </w:pPr>
+  </w:style>
+  <w:style w:type="paragraph" w:customStyle="1" w:styleId="XdQuoteList2">
+    <w:name w:val="Xd Quote List 2"/>
+    <w:basedOn w:val="Normal"/>
+    <w:qFormat/>
+    <w:pPr>
+      <w:spacing w:before="0" w:after="0" w:line="322" w:lineRule="exact"/>
+      <w:ind w:left="2160" w:right="720" w:hanging="720"/>
+    </w:pPr>
+  </w:style>
+  <w:style w:type="paragraph" w:customStyle="1" w:styleId="XdQuoteList3">
+    <w:name w:val="Xd Quote List 3"/>
+    <w:basedOn w:val="Normal"/>
+    <w:qFormat/>
+    <w:pPr>
+      <w:spacing w:before="0" w:after="0" w:line="322" w:lineRule="exact"/>
+      <w:ind w:left="2880" w:right="720" w:hanging="720"/>
     </w:pPr>
   </w:style>
   <w:style w:type="paragraph" w:customStyle="1" w:styleId="SourceCode">

</xml_diff>